<commit_message>
feat(tokens): add TinyURL button and regenerate instruction docs
- Voter Tokens: Create TinyURL button calls TinyURLs free API to shorten the vote URL and pre-fills the custom URL input; status feedback on success or failure; Clear dismisses the status
- build_volunteer_instructions.py: new script generating paper ballot volunteer instruction cards (2 per A4, election + congregational vote)
- build_manual.py, build_voter_instructions.py: updated content
- manual.docx, voter_instructions.docx, volunteer_instructions.docx: regenerated outputs

Co-Authored-By: Claude Sonnet 4.6 <noreply@anthropic.com>
</commit_message>
<xml_diff>
--- a/voter_instructions.docx
+++ b/voter_instructions.docx
@@ -17,15 +17,15 @@
         </w:tblBorders>
       </w:tblPr>
       <w:tblGrid>
-        <w:gridCol w:w="10800"/>
+        <w:gridCol w:w="10613"/>
       </w:tblGrid>
       <w:tr>
         <w:trPr>
-          <w:trHeight w:val="6983" w:hRule="atLeast"/>
+          <w:trHeight w:val="7632" w:hRule="atLeast"/>
         </w:trPr>
         <w:tc>
           <w:tcPr>
-            <w:tcW w:type="dxa" w:w="10800"/>
+            <w:tcW w:type="dxa" w:w="10613"/>
             <w:vAlign w:val="top"/>
             <w:shd w:val="clear" w:color="auto" w:fill="FAFAF8"/>
           </w:tcPr>
@@ -34,7 +34,6 @@
             <w:tblPr>
               <w:tblW w:type="auto" w:w="0"/>
               <w:tblLook w:firstColumn="1" w:firstRow="1" w:lastColumn="0" w:lastRow="0" w:noHBand="0" w:noVBand="1" w:val="04A0"/>
-              <w:jc w:val="left"/>
               <w:tblBorders>
                 <w:top w:val="none"/>
                 <w:left w:val="none"/>
@@ -45,20 +44,20 @@
               </w:tblBorders>
             </w:tblPr>
             <w:tblGrid>
-              <w:gridCol w:w="10800"/>
+              <w:gridCol w:w="10613"/>
             </w:tblGrid>
             <w:tr>
               <w:trPr>
-                <w:trHeight w:val="748" w:hRule="exact"/>
+                <w:trHeight w:val="792" w:hRule="exact"/>
               </w:trPr>
               <w:tc>
                 <w:tcPr>
-                  <w:tcW w:type="dxa" w:w="10800"/>
+                  <w:tcW w:type="dxa" w:w="10613"/>
                   <w:shd w:val="clear" w:color="auto" w:fill="1A2744"/>
                 </w:tcPr>
                 <w:p>
                   <w:pPr>
-                    <w:spacing w:before="120" w:after="80" w:line="280" w:lineRule="exact"/>
+                    <w:spacing w:before="100" w:after="60" w:line="280" w:lineRule="exact"/>
                     <w:jc w:val="center"/>
                   </w:pPr>
                   <w:r>
@@ -72,7 +71,7 @@
                 </w:p>
                 <w:p>
                   <w:pPr>
-                    <w:spacing w:before="0" w:after="120" w:line="280" w:lineRule="exact"/>
+                    <w:spacing w:before="0" w:after="100" w:line="280" w:lineRule="exact"/>
                     <w:jc w:val="center"/>
                   </w:pPr>
                   <w:r>
@@ -80,7 +79,7 @@
                       <w:color w:val="B8C8E0"/>
                       <w:sz w:val="18"/>
                     </w:rPr>
-                    <w:t>Follow these steps on your mobile device</w:t>
+                    <w:t>Follow these steps on your phone or tablet</w:t>
                   </w:r>
                 </w:p>
               </w:tc>
@@ -101,7 +100,7 @@
               </w:tblBorders>
             </w:tblPr>
             <w:tblGrid>
-              <w:gridCol w:w="10800"/>
+              <w:gridCol w:w="10613"/>
             </w:tblGrid>
             <w:tr>
               <w:trPr>
@@ -109,13 +108,58 @@
               </w:trPr>
               <w:tc>
                 <w:tcPr>
-                  <w:tcW w:type="dxa" w:w="10800"/>
+                  <w:tcW w:type="dxa" w:w="10613"/>
                   <w:shd w:val="clear" w:color="auto" w:fill="B8942A"/>
                 </w:tcPr>
                 <w:p>
                   <w:pPr>
                     <w:spacing w:before="0" w:after="0"/>
                   </w:pPr>
+                </w:p>
+              </w:tc>
+            </w:tr>
+          </w:tbl>
+          <w:p/>
+          <w:tbl>
+            <w:tblPr>
+              <w:tblW w:type="auto" w:w="0"/>
+              <w:tblLook w:firstColumn="1" w:firstRow="1" w:lastColumn="0" w:lastRow="0" w:noHBand="0" w:noVBand="1" w:val="04A0"/>
+              <w:tblBorders>
+                <w:top w:val="none"/>
+                <w:left w:val="none"/>
+                <w:bottom w:val="none"/>
+                <w:right w:val="none"/>
+                <w:insideH w:val="none"/>
+                <w:insideV w:val="none"/>
+              </w:tblBorders>
+            </w:tblPr>
+            <w:tblGrid>
+              <w:gridCol w:w="10613"/>
+            </w:tblGrid>
+            <w:tr>
+              <w:tc>
+                <w:tcPr>
+                  <w:tcW w:type="dxa" w:w="10613"/>
+                  <w:shd w:val="clear" w:color="auto" w:fill="EEF2F8"/>
+                  <w:tcBorders>
+                    <w:top w:val="single" w:sz="4" w:space="0" w:color="1A2744"/>
+                    <w:bottom w:val="single" w:sz="4" w:space="0" w:color="1A2744"/>
+                    <w:left w:val="single" w:sz="4" w:space="0" w:color="1A2744"/>
+                    <w:right w:val="single" w:sz="4" w:space="0" w:color="1A2744"/>
+                  </w:tcBorders>
+                </w:tcPr>
+                <w:p>
+                  <w:pPr>
+                    <w:spacing w:before="40" w:after="40" w:line="280" w:lineRule="exact"/>
+                  </w:pPr>
+                  <w:r>
+                    <w:rPr>
+                      <w:b/>
+                      <w:color w:val="1A2744"/>
+                      <w:sz w:val="18"/>
+                    </w:rPr>
+                    <w:t>PART A — OFFICE BEARER ELECTION  (Elder &amp; Deacon)</w:t>
+                  </w:r>
                 </w:p>
               </w:tc>
             </w:tr>
@@ -136,14 +180,13 @@
               </w:tblBorders>
             </w:tblPr>
             <w:tblGrid>
-              <w:gridCol w:w="3600"/>
-              <w:gridCol w:w="3600"/>
-              <w:gridCol w:w="3600"/>
+              <w:gridCol w:w="5306"/>
+              <w:gridCol w:w="5306"/>
             </w:tblGrid>
             <w:tr>
               <w:tc>
                 <w:tcPr>
-                  <w:tcW w:type="dxa" w:w="792"/>
+                  <w:tcW w:type="dxa" w:w="749"/>
                   <w:vAlign w:val="top"/>
                   <w:shd w:val="clear" w:color="auto" w:fill="1A2744"/>
                 </w:tcPr>
@@ -156,7 +199,7 @@
                     <w:rPr>
                       <w:b/>
                       <w:color w:val="FFFFFF"/>
-                      <w:sz w:val="28"/>
+                      <w:sz w:val="26"/>
                     </w:rPr>
                     <w:t>1</w:t>
                   </w:r>
@@ -164,7 +207,7 @@
               </w:tc>
               <w:tc>
                 <w:tcPr>
-                  <w:tcW w:type="dxa" w:w="8424"/>
+                  <w:tcW w:type="dxa" w:w="9864"/>
                   <w:vAlign w:val="top"/>
                 </w:tcPr>
                 <w:p>
@@ -175,37 +218,23 @@
                     <w:rPr>
                       <w:b/>
                       <w:color w:val="1A2744"/>
-                      <w:sz w:val="23"/>
+                      <w:sz w:val="22"/>
                     </w:rPr>
                     <w:t>Open the Voter Page</w:t>
                   </w:r>
                 </w:p>
                 <w:p>
                   <w:pPr>
-                    <w:spacing w:before="0" w:after="80" w:line="280" w:lineRule="exact"/>
+                    <w:spacing w:before="0" w:after="100" w:line="280" w:lineRule="exact"/>
                   </w:pPr>
                   <w:r>
                     <w:rPr>
                       <w:color w:val="444444"/>
-                      <w:sz w:val="20"/>
+                      <w:sz w:val="19"/>
                     </w:rPr>
-                    <w:t>Scan the QR code on your token card with your phone camera,</w:t>
-                    <w:br/>
-                    <w:t>or type the voter URL into your mobile browser.</w:t>
+                    <w:t>Scan the QR code on your token card with your phone camera, or type the voter URL into your mobile browser.</w:t>
                   </w:r>
                 </w:p>
-              </w:tc>
-              <w:tc>
-                <w:tcPr>
-                  <w:tcW w:type="dxa" w:w="1584"/>
-                  <w:tcBorders>
-                    <w:top w:val="none"/>
-                    <w:bottom w:val="none"/>
-                    <w:left w:val="none"/>
-                    <w:right w:val="none"/>
-                  </w:tcBorders>
-                </w:tcPr>
-                <w:p/>
               </w:tc>
             </w:tr>
           </w:tbl>
@@ -225,14 +254,13 @@
               </w:tblBorders>
             </w:tblPr>
             <w:tblGrid>
-              <w:gridCol w:w="3600"/>
-              <w:gridCol w:w="3600"/>
-              <w:gridCol w:w="3600"/>
+              <w:gridCol w:w="5306"/>
+              <w:gridCol w:w="5306"/>
             </w:tblGrid>
             <w:tr>
               <w:tc>
                 <w:tcPr>
-                  <w:tcW w:type="dxa" w:w="792"/>
+                  <w:tcW w:type="dxa" w:w="749"/>
                   <w:vAlign w:val="top"/>
                   <w:shd w:val="clear" w:color="auto" w:fill="1A2744"/>
                 </w:tcPr>
@@ -245,7 +273,7 @@
                     <w:rPr>
                       <w:b/>
                       <w:color w:val="FFFFFF"/>
-                      <w:sz w:val="28"/>
+                      <w:sz w:val="26"/>
                     </w:rPr>
                     <w:t>2</w:t>
                   </w:r>
@@ -253,7 +281,7 @@
               </w:tc>
               <w:tc>
                 <w:tcPr>
-                  <w:tcW w:type="dxa" w:w="8424"/>
+                  <w:tcW w:type="dxa" w:w="9864"/>
                   <w:vAlign w:val="top"/>
                 </w:tcPr>
                 <w:p>
@@ -264,37 +292,23 @@
                     <w:rPr>
                       <w:b/>
                       <w:color w:val="1A2744"/>
-                      <w:sz w:val="23"/>
+                      <w:sz w:val="22"/>
                     </w:rPr>
                     <w:t>Enter Your 4-Digit Token Code</w:t>
                   </w:r>
                 </w:p>
                 <w:p>
                   <w:pPr>
-                    <w:spacing w:before="0" w:after="80" w:line="280" w:lineRule="exact"/>
+                    <w:spacing w:before="0" w:after="100" w:line="280" w:lineRule="exact"/>
                   </w:pPr>
                   <w:r>
                     <w:rPr>
                       <w:color w:val="444444"/>
-                      <w:sz w:val="20"/>
+                      <w:sz w:val="19"/>
                     </w:rPr>
-                    <w:t>Type the code printed on your token card and tap  Submit Token.</w:t>
-                    <w:br/>
-                    <w:t>Each voter has a unique code — do not share it with others.</w:t>
+                    <w:t>Type the code printed on your token card and tap  Submit Token. Each voter has a unique code — do not share it with others.</w:t>
                   </w:r>
                 </w:p>
-              </w:tc>
-              <w:tc>
-                <w:tcPr>
-                  <w:tcW w:type="dxa" w:w="1584"/>
-                  <w:tcBorders>
-                    <w:top w:val="none"/>
-                    <w:bottom w:val="none"/>
-                    <w:left w:val="none"/>
-                    <w:right w:val="none"/>
-                  </w:tcBorders>
-                </w:tcPr>
-                <w:p/>
               </w:tc>
             </w:tr>
           </w:tbl>
@@ -314,14 +328,13 @@
               </w:tblBorders>
             </w:tblPr>
             <w:tblGrid>
-              <w:gridCol w:w="3600"/>
-              <w:gridCol w:w="3600"/>
-              <w:gridCol w:w="3600"/>
+              <w:gridCol w:w="5306"/>
+              <w:gridCol w:w="5306"/>
             </w:tblGrid>
             <w:tr>
               <w:tc>
                 <w:tcPr>
-                  <w:tcW w:type="dxa" w:w="792"/>
+                  <w:tcW w:type="dxa" w:w="749"/>
                   <w:vAlign w:val="top"/>
                   <w:shd w:val="clear" w:color="auto" w:fill="1A2744"/>
                 </w:tcPr>
@@ -334,7 +347,7 @@
                     <w:rPr>
                       <w:b/>
                       <w:color w:val="FFFFFF"/>
-                      <w:sz w:val="28"/>
+                      <w:sz w:val="26"/>
                     </w:rPr>
                     <w:t>3</w:t>
                   </w:r>
@@ -342,7 +355,7 @@
               </w:tc>
               <w:tc>
                 <w:tcPr>
-                  <w:tcW w:type="dxa" w:w="8424"/>
+                  <w:tcW w:type="dxa" w:w="9864"/>
                   <w:vAlign w:val="top"/>
                 </w:tcPr>
                 <w:p>
@@ -353,37 +366,23 @@
                     <w:rPr>
                       <w:b/>
                       <w:color w:val="1A2744"/>
-                      <w:sz w:val="23"/>
+                      <w:sz w:val="22"/>
                     </w:rPr>
                     <w:t>Select Your Candidate(s)</w:t>
                   </w:r>
                 </w:p>
                 <w:p>
                   <w:pPr>
-                    <w:spacing w:before="0" w:after="80" w:line="280" w:lineRule="exact"/>
+                    <w:spacing w:before="0" w:after="100" w:line="280" w:lineRule="exact"/>
                   </w:pPr>
                   <w:r>
                     <w:rPr>
                       <w:color w:val="444444"/>
-                      <w:sz w:val="20"/>
+                      <w:sz w:val="19"/>
                     </w:rPr>
-                    <w:t>Tap a candidate's name to select them. A coloured highlight and checkmark</w:t>
-                    <w:br/>
-                    <w:t>confirm your choice. You may select up to the number shown at the top.</w:t>
+                    <w:t>Tap a candidate's name to select. A coloured highlight and checkmark confirm your choice. You may select up to the number shown at the top of the screen.</w:t>
                   </w:r>
                 </w:p>
-              </w:tc>
-              <w:tc>
-                <w:tcPr>
-                  <w:tcW w:type="dxa" w:w="1584"/>
-                  <w:tcBorders>
-                    <w:top w:val="none"/>
-                    <w:bottom w:val="none"/>
-                    <w:left w:val="none"/>
-                    <w:right w:val="none"/>
-                  </w:tcBorders>
-                </w:tcPr>
-                <w:p/>
               </w:tc>
             </w:tr>
           </w:tbl>
@@ -403,14 +402,13 @@
               </w:tblBorders>
             </w:tblPr>
             <w:tblGrid>
-              <w:gridCol w:w="3600"/>
-              <w:gridCol w:w="3600"/>
-              <w:gridCol w:w="3600"/>
+              <w:gridCol w:w="5306"/>
+              <w:gridCol w:w="5306"/>
             </w:tblGrid>
             <w:tr>
               <w:tc>
                 <w:tcPr>
-                  <w:tcW w:type="dxa" w:w="792"/>
+                  <w:tcW w:type="dxa" w:w="749"/>
                   <w:vAlign w:val="top"/>
                   <w:shd w:val="clear" w:color="auto" w:fill="1A2744"/>
                 </w:tcPr>
@@ -423,7 +421,7 @@
                     <w:rPr>
                       <w:b/>
                       <w:color w:val="FFFFFF"/>
-                      <w:sz w:val="28"/>
+                      <w:sz w:val="26"/>
                     </w:rPr>
                     <w:t>4</w:t>
                   </w:r>
@@ -431,7 +429,7 @@
               </w:tc>
               <w:tc>
                 <w:tcPr>
-                  <w:tcW w:type="dxa" w:w="8424"/>
+                  <w:tcW w:type="dxa" w:w="9864"/>
                   <w:vAlign w:val="top"/>
                 </w:tcPr>
                 <w:p>
@@ -442,37 +440,23 @@
                     <w:rPr>
                       <w:b/>
                       <w:color w:val="1A2744"/>
-                      <w:sz w:val="23"/>
+                      <w:sz w:val="22"/>
                     </w:rPr>
                     <w:t>Submit Your Vote</w:t>
                   </w:r>
                 </w:p>
                 <w:p>
                   <w:pPr>
-                    <w:spacing w:before="0" w:after="80" w:line="280" w:lineRule="exact"/>
+                    <w:spacing w:before="0" w:after="100" w:line="280" w:lineRule="exact"/>
                   </w:pPr>
                   <w:r>
                     <w:rPr>
                       <w:color w:val="444444"/>
-                      <w:sz w:val="20"/>
+                      <w:sz w:val="19"/>
                     </w:rPr>
-                    <w:t>Tap  Submit My Vote  when you are done. A confirmation screen appears.</w:t>
-                    <w:br/>
-                    <w:t>Your vote is final — it cannot be changed after submission.</w:t>
+                    <w:t>Tap  Submit My Vote. A confirmation screen appears with your selections. Your vote is final — it cannot be changed after submission.</w:t>
                   </w:r>
                 </w:p>
-              </w:tc>
-              <w:tc>
-                <w:tcPr>
-                  <w:tcW w:type="dxa" w:w="1584"/>
-                  <w:tcBorders>
-                    <w:top w:val="none"/>
-                    <w:bottom w:val="none"/>
-                    <w:left w:val="none"/>
-                    <w:right w:val="none"/>
-                  </w:tcBorders>
-                </w:tcPr>
-                <w:p/>
               </w:tc>
             </w:tr>
           </w:tbl>
@@ -492,14 +476,13 @@
               </w:tblBorders>
             </w:tblPr>
             <w:tblGrid>
-              <w:gridCol w:w="3600"/>
-              <w:gridCol w:w="3600"/>
-              <w:gridCol w:w="3600"/>
+              <w:gridCol w:w="5306"/>
+              <w:gridCol w:w="5306"/>
             </w:tblGrid>
             <w:tr>
               <w:tc>
                 <w:tcPr>
-                  <w:tcW w:type="dxa" w:w="792"/>
+                  <w:tcW w:type="dxa" w:w="749"/>
                   <w:vAlign w:val="top"/>
                   <w:shd w:val="clear" w:color="auto" w:fill="1A2744"/>
                 </w:tcPr>
@@ -512,7 +495,7 @@
                     <w:rPr>
                       <w:b/>
                       <w:color w:val="FFFFFF"/>
-                      <w:sz w:val="28"/>
+                      <w:sz w:val="26"/>
                     </w:rPr>
                     <w:t>5</w:t>
                   </w:r>
@@ -520,7 +503,7 @@
               </w:tc>
               <w:tc>
                 <w:tcPr>
-                  <w:tcW w:type="dxa" w:w="8424"/>
+                  <w:tcW w:type="dxa" w:w="9864"/>
                   <w:vAlign w:val="top"/>
                 </w:tcPr>
                 <w:p>
@@ -531,9 +514,9 @@
                     <w:rPr>
                       <w:b/>
                       <w:color w:val="1A2744"/>
-                      <w:sz w:val="23"/>
+                      <w:sz w:val="22"/>
                     </w:rPr>
-                    <w:t>Wait for the Next Round (if applicable)</w:t>
+                    <w:t>Wait — Keep the Page Open</w:t>
                   </w:r>
                 </w:p>
                 <w:p>
@@ -543,25 +526,56 @@
                   <w:r>
                     <w:rPr>
                       <w:color w:val="444444"/>
-                      <w:sz w:val="20"/>
+                      <w:sz w:val="19"/>
                     </w:rPr>
-                    <w:t>Keep the page open. If another round or office opens, a notification</w:t>
-                    <w:br/>
-                    <w:t>appears automatically — tap  Vote Now  to continue with the same token card.</w:t>
+                    <w:t>If another round or a second office opens, a notification appears automatically. Tap  Vote Now  to continue. Use the same token card for all rounds and both offices.</w:t>
                   </w:r>
                 </w:p>
               </w:tc>
+            </w:tr>
+          </w:tbl>
+          <w:p/>
+          <w:tbl>
+            <w:tblPr>
+              <w:tblW w:type="auto" w:w="0"/>
+              <w:tblLook w:firstColumn="1" w:firstRow="1" w:lastColumn="0" w:lastRow="0" w:noHBand="0" w:noVBand="1" w:val="04A0"/>
+              <w:tblBorders>
+                <w:top w:val="none"/>
+                <w:left w:val="none"/>
+                <w:bottom w:val="none"/>
+                <w:right w:val="none"/>
+                <w:insideH w:val="none"/>
+                <w:insideV w:val="none"/>
+              </w:tblBorders>
+            </w:tblPr>
+            <w:tblGrid>
+              <w:gridCol w:w="10613"/>
+            </w:tblGrid>
+            <w:tr>
               <w:tc>
                 <w:tcPr>
-                  <w:tcW w:type="dxa" w:w="1584"/>
+                  <w:tcW w:type="dxa" w:w="10613"/>
+                  <w:shd w:val="clear" w:color="auto" w:fill="F0FAF0"/>
                   <w:tcBorders>
-                    <w:top w:val="none"/>
-                    <w:bottom w:val="none"/>
-                    <w:left w:val="none"/>
-                    <w:right w:val="none"/>
+                    <w:top w:val="single" w:sz="4" w:space="0" w:color="2D6A4F"/>
+                    <w:bottom w:val="single" w:sz="4" w:space="0" w:color="2D6A4F"/>
+                    <w:left w:val="single" w:sz="4" w:space="0" w:color="2D6A4F"/>
+                    <w:right w:val="single" w:sz="4" w:space="0" w:color="2D6A4F"/>
                   </w:tcBorders>
                 </w:tcPr>
-                <w:p/>
+                <w:p>
+                  <w:pPr>
+                    <w:spacing w:before="40" w:after="40" w:line="280" w:lineRule="exact"/>
+                  </w:pPr>
+                  <w:r>
+                    <w:rPr>
+                      <w:b/>
+                      <w:color w:val="2D6A4F"/>
+                      <w:sz w:val="18"/>
+                    </w:rPr>
+                    <w:t>PART B — CONGREGATIONAL VOTE  (Motion / Resolution)</w:t>
+                  </w:r>
+                </w:p>
               </w:tc>
             </w:tr>
           </w:tbl>
@@ -581,12 +595,233 @@
               </w:tblBorders>
             </w:tblPr>
             <w:tblGrid>
-              <w:gridCol w:w="10800"/>
+              <w:gridCol w:w="5306"/>
+              <w:gridCol w:w="5306"/>
             </w:tblGrid>
             <w:tr>
               <w:tc>
                 <w:tcPr>
-                  <w:tcW w:type="dxa" w:w="10800"/>
+                  <w:tcW w:type="dxa" w:w="749"/>
+                  <w:vAlign w:val="top"/>
+                  <w:shd w:val="clear" w:color="auto" w:fill="2D6A4F"/>
+                </w:tcPr>
+                <w:p>
+                  <w:pPr>
+                    <w:spacing w:before="60" w:after="60" w:line="280" w:lineRule="exact"/>
+                    <w:jc w:val="center"/>
+                  </w:pPr>
+                  <w:r>
+                    <w:rPr>
+                      <w:b/>
+                      <w:color w:val="FFFFFF"/>
+                      <w:sz w:val="26"/>
+                    </w:rPr>
+                    <w:t>6</w:t>
+                  </w:r>
+                </w:p>
+              </w:tc>
+              <w:tc>
+                <w:tcPr>
+                  <w:tcW w:type="dxa" w:w="9864"/>
+                  <w:vAlign w:val="top"/>
+                </w:tcPr>
+                <w:p>
+                  <w:pPr>
+                    <w:spacing w:before="40" w:after="20" w:line="280" w:lineRule="exact"/>
+                  </w:pPr>
+                  <w:r>
+                    <w:rPr>
+                      <w:b/>
+                      <w:color w:val="1A2744"/>
+                      <w:sz w:val="22"/>
+                    </w:rPr>
+                    <w:t>The Page Switches Automatically</w:t>
+                  </w:r>
+                </w:p>
+                <w:p>
+                  <w:pPr>
+                    <w:spacing w:before="0" w:after="100" w:line="280" w:lineRule="exact"/>
+                  </w:pPr>
+                  <w:r>
+                    <w:rPr>
+                      <w:color w:val="444444"/>
+                      <w:sz w:val="19"/>
+                    </w:rPr>
+                    <w:t>After the election finishes, the voter page switches to the congregational vote. Your token carries forward — you do not need to re-enter it.</w:t>
+                  </w:r>
+                </w:p>
+              </w:tc>
+            </w:tr>
+          </w:tbl>
+          <w:p/>
+          <w:tbl>
+            <w:tblPr>
+              <w:tblW w:type="auto" w:w="0"/>
+              <w:tblLook w:firstColumn="1" w:firstRow="1" w:lastColumn="0" w:lastRow="0" w:noHBand="0" w:noVBand="1" w:val="04A0"/>
+              <w:jc w:val="left"/>
+              <w:tblBorders>
+                <w:top w:val="none"/>
+                <w:left w:val="none"/>
+                <w:bottom w:val="none"/>
+                <w:right w:val="none"/>
+                <w:insideH w:val="none"/>
+                <w:insideV w:val="none"/>
+              </w:tblBorders>
+            </w:tblPr>
+            <w:tblGrid>
+              <w:gridCol w:w="5306"/>
+              <w:gridCol w:w="5306"/>
+            </w:tblGrid>
+            <w:tr>
+              <w:tc>
+                <w:tcPr>
+                  <w:tcW w:type="dxa" w:w="749"/>
+                  <w:vAlign w:val="top"/>
+                  <w:shd w:val="clear" w:color="auto" w:fill="2D6A4F"/>
+                </w:tcPr>
+                <w:p>
+                  <w:pPr>
+                    <w:spacing w:before="60" w:after="60" w:line="280" w:lineRule="exact"/>
+                    <w:jc w:val="center"/>
+                  </w:pPr>
+                  <w:r>
+                    <w:rPr>
+                      <w:b/>
+                      <w:color w:val="FFFFFF"/>
+                      <w:sz w:val="26"/>
+                    </w:rPr>
+                    <w:t>7</w:t>
+                  </w:r>
+                </w:p>
+              </w:tc>
+              <w:tc>
+                <w:tcPr>
+                  <w:tcW w:type="dxa" w:w="9864"/>
+                  <w:vAlign w:val="top"/>
+                </w:tcPr>
+                <w:p>
+                  <w:pPr>
+                    <w:spacing w:before="40" w:after="20" w:line="280" w:lineRule="exact"/>
+                  </w:pPr>
+                  <w:r>
+                    <w:rPr>
+                      <w:b/>
+                      <w:color w:val="1A2744"/>
+                      <w:sz w:val="22"/>
+                    </w:rPr>
+                    <w:t>Read the Question and Select Your Answer</w:t>
+                  </w:r>
+                </w:p>
+                <w:p>
+                  <w:pPr>
+                    <w:spacing w:before="0" w:after="100" w:line="280" w:lineRule="exact"/>
+                  </w:pPr>
+                  <w:r>
+                    <w:rPr>
+                      <w:color w:val="444444"/>
+                      <w:sz w:val="19"/>
+                    </w:rPr>
+                    <w:t>The motion is displayed on screen. Tap  In favour  or  Not in favour  (or the options shown). Then tap  Cast My Vote.</w:t>
+                  </w:r>
+                </w:p>
+              </w:tc>
+            </w:tr>
+          </w:tbl>
+          <w:p/>
+          <w:tbl>
+            <w:tblPr>
+              <w:tblW w:type="auto" w:w="0"/>
+              <w:tblLook w:firstColumn="1" w:firstRow="1" w:lastColumn="0" w:lastRow="0" w:noHBand="0" w:noVBand="1" w:val="04A0"/>
+              <w:jc w:val="left"/>
+              <w:tblBorders>
+                <w:top w:val="none"/>
+                <w:left w:val="none"/>
+                <w:bottom w:val="none"/>
+                <w:right w:val="none"/>
+                <w:insideH w:val="none"/>
+                <w:insideV w:val="none"/>
+              </w:tblBorders>
+            </w:tblPr>
+            <w:tblGrid>
+              <w:gridCol w:w="5306"/>
+              <w:gridCol w:w="5306"/>
+            </w:tblGrid>
+            <w:tr>
+              <w:tc>
+                <w:tcPr>
+                  <w:tcW w:type="dxa" w:w="749"/>
+                  <w:vAlign w:val="top"/>
+                  <w:shd w:val="clear" w:color="auto" w:fill="2D6A4F"/>
+                </w:tcPr>
+                <w:p>
+                  <w:pPr>
+                    <w:spacing w:before="60" w:after="60" w:line="280" w:lineRule="exact"/>
+                    <w:jc w:val="center"/>
+                  </w:pPr>
+                  <w:r>
+                    <w:rPr>
+                      <w:b/>
+                      <w:color w:val="FFFFFF"/>
+                      <w:sz w:val="26"/>
+                    </w:rPr>
+                    <w:t>8</w:t>
+                  </w:r>
+                </w:p>
+              </w:tc>
+              <w:tc>
+                <w:tcPr>
+                  <w:tcW w:type="dxa" w:w="9864"/>
+                  <w:vAlign w:val="top"/>
+                </w:tcPr>
+                <w:p>
+                  <w:pPr>
+                    <w:spacing w:before="40" w:after="20" w:line="280" w:lineRule="exact"/>
+                  </w:pPr>
+                  <w:r>
+                    <w:rPr>
+                      <w:b/>
+                      <w:color w:val="1A2744"/>
+                      <w:sz w:val="22"/>
+                    </w:rPr>
+                    <w:t>Confirmation</w:t>
+                  </w:r>
+                </w:p>
+                <w:p>
+                  <w:pPr>
+                    <w:spacing w:before="0" w:after="40" w:line="280" w:lineRule="exact"/>
+                  </w:pPr>
+                  <w:r>
+                    <w:rPr>
+                      <w:color w:val="444444"/>
+                      <w:sz w:val="19"/>
+                    </w:rPr>
+                    <w:t>A green "Vote Recorded" screen appears showing the question and your selected answer. Wait for the chairman to announce the result.</w:t>
+                  </w:r>
+                </w:p>
+              </w:tc>
+            </w:tr>
+          </w:tbl>
+          <w:p/>
+          <w:tbl>
+            <w:tblPr>
+              <w:tblW w:type="auto" w:w="0"/>
+              <w:tblLook w:firstColumn="1" w:firstRow="1" w:lastColumn="0" w:lastRow="0" w:noHBand="0" w:noVBand="1" w:val="04A0"/>
+              <w:tblBorders>
+                <w:top w:val="none"/>
+                <w:left w:val="none"/>
+                <w:bottom w:val="none"/>
+                <w:right w:val="none"/>
+                <w:insideH w:val="none"/>
+                <w:insideV w:val="none"/>
+              </w:tblBorders>
+            </w:tblPr>
+            <w:tblGrid>
+              <w:gridCol w:w="10613"/>
+            </w:tblGrid>
+            <w:tr>
+              <w:tc>
+                <w:tcPr>
+                  <w:tcW w:type="dxa" w:w="10613"/>
                   <w:shd w:val="clear" w:color="auto" w:fill="FFF8E6"/>
                   <w:tcBorders>
                     <w:top w:val="single" w:sz="6" w:space="0" w:color="B8942A"/>
@@ -597,8 +832,7 @@
                 </w:tcPr>
                 <w:p>
                   <w:pPr>
-                    <w:spacing w:before="80" w:after="40" w:line="280" w:lineRule="exact"/>
-                    <w:jc w:val="left"/>
+                    <w:spacing w:before="60" w:after="40" w:line="280" w:lineRule="exact"/>
                   </w:pPr>
                   <w:r>
                     <w:rPr>
@@ -616,9 +850,9 @@
                   <w:r>
                     <w:rPr>
                       <w:color w:val="444444"/>
-                      <w:sz w:val="18"/>
+                      <w:sz w:val="17"/>
                     </w:rPr>
-                    <w:t>▸  "Voting Round Closed" — the chairman has paused voting. Keep the page open; it will update automatically.</w:t>
+                    <w:t>▸  "Voting Round Closed" — chairman has paused voting. Keep the page open; it updates automatically.</w:t>
                   </w:r>
                 </w:p>
                 <w:p>
@@ -628,7 +862,7 @@
                   <w:r>
                     <w:rPr>
                       <w:color w:val="444444"/>
-                      <w:sz w:val="18"/>
+                      <w:sz w:val="17"/>
                     </w:rPr>
                     <w:t>▸  "Token already used" — you have already voted this round. One vote per round per office.</w:t>
                   </w:r>
@@ -640,9 +874,9 @@
                   <w:r>
                     <w:rPr>
                       <w:color w:val="444444"/>
-                      <w:sz w:val="18"/>
+                      <w:sz w:val="17"/>
                     </w:rPr>
-                    <w:t>▸  Your vote is completely anonymous. No one can see what you selected.</w:t>
+                    <w:t>▸  Your vote is completely anonymous — no one can see what you selected.</w:t>
                   </w:r>
                 </w:p>
                 <w:p>
@@ -652,9 +886,9 @@
                   <w:r>
                     <w:rPr>
                       <w:color w:val="444444"/>
-                      <w:sz w:val="18"/>
+                      <w:sz w:val="17"/>
                     </w:rPr>
-                    <w:t>▸  One token card covers all rounds and both offices (Elder and Deacon).</w:t>
+                    <w:t>▸  One token card covers all rounds, both offices, and the congregational vote.</w:t>
                   </w:r>
                 </w:p>
                 <w:p>
@@ -664,9 +898,9 @@
                   <w:r>
                     <w:rPr>
                       <w:color w:val="444444"/>
-                      <w:sz w:val="18"/>
+                      <w:sz w:val="17"/>
                     </w:rPr>
-                    <w:t>▸  If you have difficulty, ask the paper ballot volunteer for a paper ballot instead.</w:t>
+                    <w:t>▸  Having trouble? Ask the paper ballot volunteer for a paper ballot instead.</w:t>
                   </w:r>
                 </w:p>
                 <w:p>
@@ -689,7 +923,7 @@
                 <w:color w:val="666666"/>
                 <w:sz w:val="16"/>
               </w:rPr>
-              <w:t>Your vote is anonymous  ·  Keep this page open until the election is complete</w:t>
+              <w:t>Your vote is anonymous  ·  Keep this page open until all voting is complete</w:t>
             </w:r>
           </w:p>
         </w:tc>
@@ -700,7 +934,7 @@
         </w:trPr>
         <w:tc>
           <w:tcPr>
-            <w:tcW w:type="dxa" w:w="10800"/>
+            <w:tcW w:type="dxa" w:w="10613"/>
             <w:shd w:val="clear" w:color="auto" w:fill="FFFFFF"/>
             <w:tcBorders>
               <w:top w:val="dashed" w:sz="6" w:space="0" w:color="AAAAAA"/>
@@ -727,11 +961,11 @@
       </w:tr>
       <w:tr>
         <w:trPr>
-          <w:trHeight w:val="6983" w:hRule="atLeast"/>
+          <w:trHeight w:val="7632" w:hRule="atLeast"/>
         </w:trPr>
         <w:tc>
           <w:tcPr>
-            <w:tcW w:type="dxa" w:w="10800"/>
+            <w:tcW w:type="dxa" w:w="10613"/>
             <w:vAlign w:val="top"/>
             <w:shd w:val="clear" w:color="auto" w:fill="FAFAF8"/>
           </w:tcPr>
@@ -740,7 +974,6 @@
             <w:tblPr>
               <w:tblW w:type="auto" w:w="0"/>
               <w:tblLook w:firstColumn="1" w:firstRow="1" w:lastColumn="0" w:lastRow="0" w:noHBand="0" w:noVBand="1" w:val="04A0"/>
-              <w:jc w:val="left"/>
               <w:tblBorders>
                 <w:top w:val="none"/>
                 <w:left w:val="none"/>
@@ -751,20 +984,20 @@
               </w:tblBorders>
             </w:tblPr>
             <w:tblGrid>
-              <w:gridCol w:w="10800"/>
+              <w:gridCol w:w="10613"/>
             </w:tblGrid>
             <w:tr>
               <w:trPr>
-                <w:trHeight w:val="748" w:hRule="exact"/>
+                <w:trHeight w:val="792" w:hRule="exact"/>
               </w:trPr>
               <w:tc>
                 <w:tcPr>
-                  <w:tcW w:type="dxa" w:w="10800"/>
+                  <w:tcW w:type="dxa" w:w="10613"/>
                   <w:shd w:val="clear" w:color="auto" w:fill="1A2744"/>
                 </w:tcPr>
                 <w:p>
                   <w:pPr>
-                    <w:spacing w:before="120" w:after="80" w:line="280" w:lineRule="exact"/>
+                    <w:spacing w:before="100" w:after="60" w:line="280" w:lineRule="exact"/>
                     <w:jc w:val="center"/>
                   </w:pPr>
                   <w:r>
@@ -778,7 +1011,7 @@
                 </w:p>
                 <w:p>
                   <w:pPr>
-                    <w:spacing w:before="0" w:after="120" w:line="280" w:lineRule="exact"/>
+                    <w:spacing w:before="0" w:after="100" w:line="280" w:lineRule="exact"/>
                     <w:jc w:val="center"/>
                   </w:pPr>
                   <w:r>
@@ -786,7 +1019,7 @@
                       <w:color w:val="B8C8E0"/>
                       <w:sz w:val="18"/>
                     </w:rPr>
-                    <w:t>Follow these steps on your mobile device</w:t>
+                    <w:t>Follow these steps on your phone or tablet</w:t>
                   </w:r>
                 </w:p>
               </w:tc>
@@ -807,7 +1040,7 @@
               </w:tblBorders>
             </w:tblPr>
             <w:tblGrid>
-              <w:gridCol w:w="10800"/>
+              <w:gridCol w:w="10613"/>
             </w:tblGrid>
             <w:tr>
               <w:trPr>
@@ -815,13 +1048,58 @@
               </w:trPr>
               <w:tc>
                 <w:tcPr>
-                  <w:tcW w:type="dxa" w:w="10800"/>
+                  <w:tcW w:type="dxa" w:w="10613"/>
                   <w:shd w:val="clear" w:color="auto" w:fill="B8942A"/>
                 </w:tcPr>
                 <w:p>
                   <w:pPr>
                     <w:spacing w:before="0" w:after="0"/>
                   </w:pPr>
+                </w:p>
+              </w:tc>
+            </w:tr>
+          </w:tbl>
+          <w:p/>
+          <w:tbl>
+            <w:tblPr>
+              <w:tblW w:type="auto" w:w="0"/>
+              <w:tblLook w:firstColumn="1" w:firstRow="1" w:lastColumn="0" w:lastRow="0" w:noHBand="0" w:noVBand="1" w:val="04A0"/>
+              <w:tblBorders>
+                <w:top w:val="none"/>
+                <w:left w:val="none"/>
+                <w:bottom w:val="none"/>
+                <w:right w:val="none"/>
+                <w:insideH w:val="none"/>
+                <w:insideV w:val="none"/>
+              </w:tblBorders>
+            </w:tblPr>
+            <w:tblGrid>
+              <w:gridCol w:w="10613"/>
+            </w:tblGrid>
+            <w:tr>
+              <w:tc>
+                <w:tcPr>
+                  <w:tcW w:type="dxa" w:w="10613"/>
+                  <w:shd w:val="clear" w:color="auto" w:fill="EEF2F8"/>
+                  <w:tcBorders>
+                    <w:top w:val="single" w:sz="4" w:space="0" w:color="1A2744"/>
+                    <w:bottom w:val="single" w:sz="4" w:space="0" w:color="1A2744"/>
+                    <w:left w:val="single" w:sz="4" w:space="0" w:color="1A2744"/>
+                    <w:right w:val="single" w:sz="4" w:space="0" w:color="1A2744"/>
+                  </w:tcBorders>
+                </w:tcPr>
+                <w:p>
+                  <w:pPr>
+                    <w:spacing w:before="40" w:after="40" w:line="280" w:lineRule="exact"/>
+                  </w:pPr>
+                  <w:r>
+                    <w:rPr>
+                      <w:b/>
+                      <w:color w:val="1A2744"/>
+                      <w:sz w:val="18"/>
+                    </w:rPr>
+                    <w:t>PART A — OFFICE BEARER ELECTION  (Elder &amp; Deacon)</w:t>
+                  </w:r>
                 </w:p>
               </w:tc>
             </w:tr>
@@ -842,14 +1120,13 @@
               </w:tblBorders>
             </w:tblPr>
             <w:tblGrid>
-              <w:gridCol w:w="3600"/>
-              <w:gridCol w:w="3600"/>
-              <w:gridCol w:w="3600"/>
+              <w:gridCol w:w="5306"/>
+              <w:gridCol w:w="5306"/>
             </w:tblGrid>
             <w:tr>
               <w:tc>
                 <w:tcPr>
-                  <w:tcW w:type="dxa" w:w="792"/>
+                  <w:tcW w:type="dxa" w:w="749"/>
                   <w:vAlign w:val="top"/>
                   <w:shd w:val="clear" w:color="auto" w:fill="1A2744"/>
                 </w:tcPr>
@@ -862,7 +1139,7 @@
                     <w:rPr>
                       <w:b/>
                       <w:color w:val="FFFFFF"/>
-                      <w:sz w:val="28"/>
+                      <w:sz w:val="26"/>
                     </w:rPr>
                     <w:t>1</w:t>
                   </w:r>
@@ -870,7 +1147,7 @@
               </w:tc>
               <w:tc>
                 <w:tcPr>
-                  <w:tcW w:type="dxa" w:w="8424"/>
+                  <w:tcW w:type="dxa" w:w="9864"/>
                   <w:vAlign w:val="top"/>
                 </w:tcPr>
                 <w:p>
@@ -881,37 +1158,23 @@
                     <w:rPr>
                       <w:b/>
                       <w:color w:val="1A2744"/>
-                      <w:sz w:val="23"/>
+                      <w:sz w:val="22"/>
                     </w:rPr>
                     <w:t>Open the Voter Page</w:t>
                   </w:r>
                 </w:p>
                 <w:p>
                   <w:pPr>
-                    <w:spacing w:before="0" w:after="80" w:line="280" w:lineRule="exact"/>
+                    <w:spacing w:before="0" w:after="100" w:line="280" w:lineRule="exact"/>
                   </w:pPr>
                   <w:r>
                     <w:rPr>
                       <w:color w:val="444444"/>
-                      <w:sz w:val="20"/>
+                      <w:sz w:val="19"/>
                     </w:rPr>
-                    <w:t>Scan the QR code on your token card with your phone camera,</w:t>
-                    <w:br/>
-                    <w:t>or type the voter URL into your mobile browser.</w:t>
+                    <w:t>Scan the QR code on your token card with your phone camera, or type the voter URL into your mobile browser.</w:t>
                   </w:r>
                 </w:p>
-              </w:tc>
-              <w:tc>
-                <w:tcPr>
-                  <w:tcW w:type="dxa" w:w="1584"/>
-                  <w:tcBorders>
-                    <w:top w:val="none"/>
-                    <w:bottom w:val="none"/>
-                    <w:left w:val="none"/>
-                    <w:right w:val="none"/>
-                  </w:tcBorders>
-                </w:tcPr>
-                <w:p/>
               </w:tc>
             </w:tr>
           </w:tbl>
@@ -931,14 +1194,13 @@
               </w:tblBorders>
             </w:tblPr>
             <w:tblGrid>
-              <w:gridCol w:w="3600"/>
-              <w:gridCol w:w="3600"/>
-              <w:gridCol w:w="3600"/>
+              <w:gridCol w:w="5306"/>
+              <w:gridCol w:w="5306"/>
             </w:tblGrid>
             <w:tr>
               <w:tc>
                 <w:tcPr>
-                  <w:tcW w:type="dxa" w:w="792"/>
+                  <w:tcW w:type="dxa" w:w="749"/>
                   <w:vAlign w:val="top"/>
                   <w:shd w:val="clear" w:color="auto" w:fill="1A2744"/>
                 </w:tcPr>
@@ -951,7 +1213,7 @@
                     <w:rPr>
                       <w:b/>
                       <w:color w:val="FFFFFF"/>
-                      <w:sz w:val="28"/>
+                      <w:sz w:val="26"/>
                     </w:rPr>
                     <w:t>2</w:t>
                   </w:r>
@@ -959,7 +1221,7 @@
               </w:tc>
               <w:tc>
                 <w:tcPr>
-                  <w:tcW w:type="dxa" w:w="8424"/>
+                  <w:tcW w:type="dxa" w:w="9864"/>
                   <w:vAlign w:val="top"/>
                 </w:tcPr>
                 <w:p>
@@ -970,37 +1232,23 @@
                     <w:rPr>
                       <w:b/>
                       <w:color w:val="1A2744"/>
-                      <w:sz w:val="23"/>
+                      <w:sz w:val="22"/>
                     </w:rPr>
                     <w:t>Enter Your 4-Digit Token Code</w:t>
                   </w:r>
                 </w:p>
                 <w:p>
                   <w:pPr>
-                    <w:spacing w:before="0" w:after="80" w:line="280" w:lineRule="exact"/>
+                    <w:spacing w:before="0" w:after="100" w:line="280" w:lineRule="exact"/>
                   </w:pPr>
                   <w:r>
                     <w:rPr>
                       <w:color w:val="444444"/>
-                      <w:sz w:val="20"/>
+                      <w:sz w:val="19"/>
                     </w:rPr>
-                    <w:t>Type the code printed on your token card and tap  Submit Token.</w:t>
-                    <w:br/>
-                    <w:t>Each voter has a unique code — do not share it with others.</w:t>
+                    <w:t>Type the code printed on your token card and tap  Submit Token. Each voter has a unique code — do not share it with others.</w:t>
                   </w:r>
                 </w:p>
-              </w:tc>
-              <w:tc>
-                <w:tcPr>
-                  <w:tcW w:type="dxa" w:w="1584"/>
-                  <w:tcBorders>
-                    <w:top w:val="none"/>
-                    <w:bottom w:val="none"/>
-                    <w:left w:val="none"/>
-                    <w:right w:val="none"/>
-                  </w:tcBorders>
-                </w:tcPr>
-                <w:p/>
               </w:tc>
             </w:tr>
           </w:tbl>
@@ -1020,14 +1268,13 @@
               </w:tblBorders>
             </w:tblPr>
             <w:tblGrid>
-              <w:gridCol w:w="3600"/>
-              <w:gridCol w:w="3600"/>
-              <w:gridCol w:w="3600"/>
+              <w:gridCol w:w="5306"/>
+              <w:gridCol w:w="5306"/>
             </w:tblGrid>
             <w:tr>
               <w:tc>
                 <w:tcPr>
-                  <w:tcW w:type="dxa" w:w="792"/>
+                  <w:tcW w:type="dxa" w:w="749"/>
                   <w:vAlign w:val="top"/>
                   <w:shd w:val="clear" w:color="auto" w:fill="1A2744"/>
                 </w:tcPr>
@@ -1040,7 +1287,7 @@
                     <w:rPr>
                       <w:b/>
                       <w:color w:val="FFFFFF"/>
-                      <w:sz w:val="28"/>
+                      <w:sz w:val="26"/>
                     </w:rPr>
                     <w:t>3</w:t>
                   </w:r>
@@ -1048,7 +1295,7 @@
               </w:tc>
               <w:tc>
                 <w:tcPr>
-                  <w:tcW w:type="dxa" w:w="8424"/>
+                  <w:tcW w:type="dxa" w:w="9864"/>
                   <w:vAlign w:val="top"/>
                 </w:tcPr>
                 <w:p>
@@ -1059,37 +1306,23 @@
                     <w:rPr>
                       <w:b/>
                       <w:color w:val="1A2744"/>
-                      <w:sz w:val="23"/>
+                      <w:sz w:val="22"/>
                     </w:rPr>
                     <w:t>Select Your Candidate(s)</w:t>
                   </w:r>
                 </w:p>
                 <w:p>
                   <w:pPr>
-                    <w:spacing w:before="0" w:after="80" w:line="280" w:lineRule="exact"/>
+                    <w:spacing w:before="0" w:after="100" w:line="280" w:lineRule="exact"/>
                   </w:pPr>
                   <w:r>
                     <w:rPr>
                       <w:color w:val="444444"/>
-                      <w:sz w:val="20"/>
+                      <w:sz w:val="19"/>
                     </w:rPr>
-                    <w:t>Tap a candidate's name to select them. A coloured highlight and checkmark</w:t>
-                    <w:br/>
-                    <w:t>confirm your choice. You may select up to the number shown at the top.</w:t>
+                    <w:t>Tap a candidate's name to select. A coloured highlight and checkmark confirm your choice. You may select up to the number shown at the top of the screen.</w:t>
                   </w:r>
                 </w:p>
-              </w:tc>
-              <w:tc>
-                <w:tcPr>
-                  <w:tcW w:type="dxa" w:w="1584"/>
-                  <w:tcBorders>
-                    <w:top w:val="none"/>
-                    <w:bottom w:val="none"/>
-                    <w:left w:val="none"/>
-                    <w:right w:val="none"/>
-                  </w:tcBorders>
-                </w:tcPr>
-                <w:p/>
               </w:tc>
             </w:tr>
           </w:tbl>
@@ -1109,14 +1342,13 @@
               </w:tblBorders>
             </w:tblPr>
             <w:tblGrid>
-              <w:gridCol w:w="3600"/>
-              <w:gridCol w:w="3600"/>
-              <w:gridCol w:w="3600"/>
+              <w:gridCol w:w="5306"/>
+              <w:gridCol w:w="5306"/>
             </w:tblGrid>
             <w:tr>
               <w:tc>
                 <w:tcPr>
-                  <w:tcW w:type="dxa" w:w="792"/>
+                  <w:tcW w:type="dxa" w:w="749"/>
                   <w:vAlign w:val="top"/>
                   <w:shd w:val="clear" w:color="auto" w:fill="1A2744"/>
                 </w:tcPr>
@@ -1129,7 +1361,7 @@
                     <w:rPr>
                       <w:b/>
                       <w:color w:val="FFFFFF"/>
-                      <w:sz w:val="28"/>
+                      <w:sz w:val="26"/>
                     </w:rPr>
                     <w:t>4</w:t>
                   </w:r>
@@ -1137,7 +1369,7 @@
               </w:tc>
               <w:tc>
                 <w:tcPr>
-                  <w:tcW w:type="dxa" w:w="8424"/>
+                  <w:tcW w:type="dxa" w:w="9864"/>
                   <w:vAlign w:val="top"/>
                 </w:tcPr>
                 <w:p>
@@ -1148,37 +1380,23 @@
                     <w:rPr>
                       <w:b/>
                       <w:color w:val="1A2744"/>
-                      <w:sz w:val="23"/>
+                      <w:sz w:val="22"/>
                     </w:rPr>
                     <w:t>Submit Your Vote</w:t>
                   </w:r>
                 </w:p>
                 <w:p>
                   <w:pPr>
-                    <w:spacing w:before="0" w:after="80" w:line="280" w:lineRule="exact"/>
+                    <w:spacing w:before="0" w:after="100" w:line="280" w:lineRule="exact"/>
                   </w:pPr>
                   <w:r>
                     <w:rPr>
                       <w:color w:val="444444"/>
-                      <w:sz w:val="20"/>
+                      <w:sz w:val="19"/>
                     </w:rPr>
-                    <w:t>Tap  Submit My Vote  when you are done. A confirmation screen appears.</w:t>
-                    <w:br/>
-                    <w:t>Your vote is final — it cannot be changed after submission.</w:t>
+                    <w:t>Tap  Submit My Vote. A confirmation screen appears with your selections. Your vote is final — it cannot be changed after submission.</w:t>
                   </w:r>
                 </w:p>
-              </w:tc>
-              <w:tc>
-                <w:tcPr>
-                  <w:tcW w:type="dxa" w:w="1584"/>
-                  <w:tcBorders>
-                    <w:top w:val="none"/>
-                    <w:bottom w:val="none"/>
-                    <w:left w:val="none"/>
-                    <w:right w:val="none"/>
-                  </w:tcBorders>
-                </w:tcPr>
-                <w:p/>
               </w:tc>
             </w:tr>
           </w:tbl>
@@ -1198,14 +1416,13 @@
               </w:tblBorders>
             </w:tblPr>
             <w:tblGrid>
-              <w:gridCol w:w="3600"/>
-              <w:gridCol w:w="3600"/>
-              <w:gridCol w:w="3600"/>
+              <w:gridCol w:w="5306"/>
+              <w:gridCol w:w="5306"/>
             </w:tblGrid>
             <w:tr>
               <w:tc>
                 <w:tcPr>
-                  <w:tcW w:type="dxa" w:w="792"/>
+                  <w:tcW w:type="dxa" w:w="749"/>
                   <w:vAlign w:val="top"/>
                   <w:shd w:val="clear" w:color="auto" w:fill="1A2744"/>
                 </w:tcPr>
@@ -1218,7 +1435,7 @@
                     <w:rPr>
                       <w:b/>
                       <w:color w:val="FFFFFF"/>
-                      <w:sz w:val="28"/>
+                      <w:sz w:val="26"/>
                     </w:rPr>
                     <w:t>5</w:t>
                   </w:r>
@@ -1226,7 +1443,7 @@
               </w:tc>
               <w:tc>
                 <w:tcPr>
-                  <w:tcW w:type="dxa" w:w="8424"/>
+                  <w:tcW w:type="dxa" w:w="9864"/>
                   <w:vAlign w:val="top"/>
                 </w:tcPr>
                 <w:p>
@@ -1237,9 +1454,9 @@
                     <w:rPr>
                       <w:b/>
                       <w:color w:val="1A2744"/>
-                      <w:sz w:val="23"/>
+                      <w:sz w:val="22"/>
                     </w:rPr>
-                    <w:t>Wait for the Next Round (if applicable)</w:t>
+                    <w:t>Wait — Keep the Page Open</w:t>
                   </w:r>
                 </w:p>
                 <w:p>
@@ -1249,25 +1466,56 @@
                   <w:r>
                     <w:rPr>
                       <w:color w:val="444444"/>
-                      <w:sz w:val="20"/>
+                      <w:sz w:val="19"/>
                     </w:rPr>
-                    <w:t>Keep the page open. If another round or office opens, a notification</w:t>
-                    <w:br/>
-                    <w:t>appears automatically — tap  Vote Now  to continue with the same token card.</w:t>
+                    <w:t>If another round or a second office opens, a notification appears automatically. Tap  Vote Now  to continue. Use the same token card for all rounds and both offices.</w:t>
                   </w:r>
                 </w:p>
               </w:tc>
+            </w:tr>
+          </w:tbl>
+          <w:p/>
+          <w:tbl>
+            <w:tblPr>
+              <w:tblW w:type="auto" w:w="0"/>
+              <w:tblLook w:firstColumn="1" w:firstRow="1" w:lastColumn="0" w:lastRow="0" w:noHBand="0" w:noVBand="1" w:val="04A0"/>
+              <w:tblBorders>
+                <w:top w:val="none"/>
+                <w:left w:val="none"/>
+                <w:bottom w:val="none"/>
+                <w:right w:val="none"/>
+                <w:insideH w:val="none"/>
+                <w:insideV w:val="none"/>
+              </w:tblBorders>
+            </w:tblPr>
+            <w:tblGrid>
+              <w:gridCol w:w="10613"/>
+            </w:tblGrid>
+            <w:tr>
               <w:tc>
                 <w:tcPr>
-                  <w:tcW w:type="dxa" w:w="1584"/>
+                  <w:tcW w:type="dxa" w:w="10613"/>
+                  <w:shd w:val="clear" w:color="auto" w:fill="F0FAF0"/>
                   <w:tcBorders>
-                    <w:top w:val="none"/>
-                    <w:bottom w:val="none"/>
-                    <w:left w:val="none"/>
-                    <w:right w:val="none"/>
+                    <w:top w:val="single" w:sz="4" w:space="0" w:color="2D6A4F"/>
+                    <w:bottom w:val="single" w:sz="4" w:space="0" w:color="2D6A4F"/>
+                    <w:left w:val="single" w:sz="4" w:space="0" w:color="2D6A4F"/>
+                    <w:right w:val="single" w:sz="4" w:space="0" w:color="2D6A4F"/>
                   </w:tcBorders>
                 </w:tcPr>
-                <w:p/>
+                <w:p>
+                  <w:pPr>
+                    <w:spacing w:before="40" w:after="40" w:line="280" w:lineRule="exact"/>
+                  </w:pPr>
+                  <w:r>
+                    <w:rPr>
+                      <w:b/>
+                      <w:color w:val="2D6A4F"/>
+                      <w:sz w:val="18"/>
+                    </w:rPr>
+                    <w:t>PART B — CONGREGATIONAL VOTE  (Motion / Resolution)</w:t>
+                  </w:r>
+                </w:p>
               </w:tc>
             </w:tr>
           </w:tbl>
@@ -1287,12 +1535,233 @@
               </w:tblBorders>
             </w:tblPr>
             <w:tblGrid>
-              <w:gridCol w:w="10800"/>
+              <w:gridCol w:w="5306"/>
+              <w:gridCol w:w="5306"/>
             </w:tblGrid>
             <w:tr>
               <w:tc>
                 <w:tcPr>
-                  <w:tcW w:type="dxa" w:w="10800"/>
+                  <w:tcW w:type="dxa" w:w="749"/>
+                  <w:vAlign w:val="top"/>
+                  <w:shd w:val="clear" w:color="auto" w:fill="2D6A4F"/>
+                </w:tcPr>
+                <w:p>
+                  <w:pPr>
+                    <w:spacing w:before="60" w:after="60" w:line="280" w:lineRule="exact"/>
+                    <w:jc w:val="center"/>
+                  </w:pPr>
+                  <w:r>
+                    <w:rPr>
+                      <w:b/>
+                      <w:color w:val="FFFFFF"/>
+                      <w:sz w:val="26"/>
+                    </w:rPr>
+                    <w:t>6</w:t>
+                  </w:r>
+                </w:p>
+              </w:tc>
+              <w:tc>
+                <w:tcPr>
+                  <w:tcW w:type="dxa" w:w="9864"/>
+                  <w:vAlign w:val="top"/>
+                </w:tcPr>
+                <w:p>
+                  <w:pPr>
+                    <w:spacing w:before="40" w:after="20" w:line="280" w:lineRule="exact"/>
+                  </w:pPr>
+                  <w:r>
+                    <w:rPr>
+                      <w:b/>
+                      <w:color w:val="1A2744"/>
+                      <w:sz w:val="22"/>
+                    </w:rPr>
+                    <w:t>The Page Switches Automatically</w:t>
+                  </w:r>
+                </w:p>
+                <w:p>
+                  <w:pPr>
+                    <w:spacing w:before="0" w:after="100" w:line="280" w:lineRule="exact"/>
+                  </w:pPr>
+                  <w:r>
+                    <w:rPr>
+                      <w:color w:val="444444"/>
+                      <w:sz w:val="19"/>
+                    </w:rPr>
+                    <w:t>After the election finishes, the voter page switches to the congregational vote. Your token carries forward — you do not need to re-enter it.</w:t>
+                  </w:r>
+                </w:p>
+              </w:tc>
+            </w:tr>
+          </w:tbl>
+          <w:p/>
+          <w:tbl>
+            <w:tblPr>
+              <w:tblW w:type="auto" w:w="0"/>
+              <w:tblLook w:firstColumn="1" w:firstRow="1" w:lastColumn="0" w:lastRow="0" w:noHBand="0" w:noVBand="1" w:val="04A0"/>
+              <w:jc w:val="left"/>
+              <w:tblBorders>
+                <w:top w:val="none"/>
+                <w:left w:val="none"/>
+                <w:bottom w:val="none"/>
+                <w:right w:val="none"/>
+                <w:insideH w:val="none"/>
+                <w:insideV w:val="none"/>
+              </w:tblBorders>
+            </w:tblPr>
+            <w:tblGrid>
+              <w:gridCol w:w="5306"/>
+              <w:gridCol w:w="5306"/>
+            </w:tblGrid>
+            <w:tr>
+              <w:tc>
+                <w:tcPr>
+                  <w:tcW w:type="dxa" w:w="749"/>
+                  <w:vAlign w:val="top"/>
+                  <w:shd w:val="clear" w:color="auto" w:fill="2D6A4F"/>
+                </w:tcPr>
+                <w:p>
+                  <w:pPr>
+                    <w:spacing w:before="60" w:after="60" w:line="280" w:lineRule="exact"/>
+                    <w:jc w:val="center"/>
+                  </w:pPr>
+                  <w:r>
+                    <w:rPr>
+                      <w:b/>
+                      <w:color w:val="FFFFFF"/>
+                      <w:sz w:val="26"/>
+                    </w:rPr>
+                    <w:t>7</w:t>
+                  </w:r>
+                </w:p>
+              </w:tc>
+              <w:tc>
+                <w:tcPr>
+                  <w:tcW w:type="dxa" w:w="9864"/>
+                  <w:vAlign w:val="top"/>
+                </w:tcPr>
+                <w:p>
+                  <w:pPr>
+                    <w:spacing w:before="40" w:after="20" w:line="280" w:lineRule="exact"/>
+                  </w:pPr>
+                  <w:r>
+                    <w:rPr>
+                      <w:b/>
+                      <w:color w:val="1A2744"/>
+                      <w:sz w:val="22"/>
+                    </w:rPr>
+                    <w:t>Read the Question and Select Your Answer</w:t>
+                  </w:r>
+                </w:p>
+                <w:p>
+                  <w:pPr>
+                    <w:spacing w:before="0" w:after="100" w:line="280" w:lineRule="exact"/>
+                  </w:pPr>
+                  <w:r>
+                    <w:rPr>
+                      <w:color w:val="444444"/>
+                      <w:sz w:val="19"/>
+                    </w:rPr>
+                    <w:t>The motion is displayed on screen. Tap  In favour  or  Not in favour  (or the options shown). Then tap  Cast My Vote.</w:t>
+                  </w:r>
+                </w:p>
+              </w:tc>
+            </w:tr>
+          </w:tbl>
+          <w:p/>
+          <w:tbl>
+            <w:tblPr>
+              <w:tblW w:type="auto" w:w="0"/>
+              <w:tblLook w:firstColumn="1" w:firstRow="1" w:lastColumn="0" w:lastRow="0" w:noHBand="0" w:noVBand="1" w:val="04A0"/>
+              <w:jc w:val="left"/>
+              <w:tblBorders>
+                <w:top w:val="none"/>
+                <w:left w:val="none"/>
+                <w:bottom w:val="none"/>
+                <w:right w:val="none"/>
+                <w:insideH w:val="none"/>
+                <w:insideV w:val="none"/>
+              </w:tblBorders>
+            </w:tblPr>
+            <w:tblGrid>
+              <w:gridCol w:w="5306"/>
+              <w:gridCol w:w="5306"/>
+            </w:tblGrid>
+            <w:tr>
+              <w:tc>
+                <w:tcPr>
+                  <w:tcW w:type="dxa" w:w="749"/>
+                  <w:vAlign w:val="top"/>
+                  <w:shd w:val="clear" w:color="auto" w:fill="2D6A4F"/>
+                </w:tcPr>
+                <w:p>
+                  <w:pPr>
+                    <w:spacing w:before="60" w:after="60" w:line="280" w:lineRule="exact"/>
+                    <w:jc w:val="center"/>
+                  </w:pPr>
+                  <w:r>
+                    <w:rPr>
+                      <w:b/>
+                      <w:color w:val="FFFFFF"/>
+                      <w:sz w:val="26"/>
+                    </w:rPr>
+                    <w:t>8</w:t>
+                  </w:r>
+                </w:p>
+              </w:tc>
+              <w:tc>
+                <w:tcPr>
+                  <w:tcW w:type="dxa" w:w="9864"/>
+                  <w:vAlign w:val="top"/>
+                </w:tcPr>
+                <w:p>
+                  <w:pPr>
+                    <w:spacing w:before="40" w:after="20" w:line="280" w:lineRule="exact"/>
+                  </w:pPr>
+                  <w:r>
+                    <w:rPr>
+                      <w:b/>
+                      <w:color w:val="1A2744"/>
+                      <w:sz w:val="22"/>
+                    </w:rPr>
+                    <w:t>Confirmation</w:t>
+                  </w:r>
+                </w:p>
+                <w:p>
+                  <w:pPr>
+                    <w:spacing w:before="0" w:after="40" w:line="280" w:lineRule="exact"/>
+                  </w:pPr>
+                  <w:r>
+                    <w:rPr>
+                      <w:color w:val="444444"/>
+                      <w:sz w:val="19"/>
+                    </w:rPr>
+                    <w:t>A green "Vote Recorded" screen appears showing the question and your selected answer. Wait for the chairman to announce the result.</w:t>
+                  </w:r>
+                </w:p>
+              </w:tc>
+            </w:tr>
+          </w:tbl>
+          <w:p/>
+          <w:tbl>
+            <w:tblPr>
+              <w:tblW w:type="auto" w:w="0"/>
+              <w:tblLook w:firstColumn="1" w:firstRow="1" w:lastColumn="0" w:lastRow="0" w:noHBand="0" w:noVBand="1" w:val="04A0"/>
+              <w:tblBorders>
+                <w:top w:val="none"/>
+                <w:left w:val="none"/>
+                <w:bottom w:val="none"/>
+                <w:right w:val="none"/>
+                <w:insideH w:val="none"/>
+                <w:insideV w:val="none"/>
+              </w:tblBorders>
+            </w:tblPr>
+            <w:tblGrid>
+              <w:gridCol w:w="10613"/>
+            </w:tblGrid>
+            <w:tr>
+              <w:tc>
+                <w:tcPr>
+                  <w:tcW w:type="dxa" w:w="10613"/>
                   <w:shd w:val="clear" w:color="auto" w:fill="FFF8E6"/>
                   <w:tcBorders>
                     <w:top w:val="single" w:sz="6" w:space="0" w:color="B8942A"/>
@@ -1303,8 +1772,7 @@
                 </w:tcPr>
                 <w:p>
                   <w:pPr>
-                    <w:spacing w:before="80" w:after="40" w:line="280" w:lineRule="exact"/>
-                    <w:jc w:val="left"/>
+                    <w:spacing w:before="60" w:after="40" w:line="280" w:lineRule="exact"/>
                   </w:pPr>
                   <w:r>
                     <w:rPr>
@@ -1322,9 +1790,9 @@
                   <w:r>
                     <w:rPr>
                       <w:color w:val="444444"/>
-                      <w:sz w:val="18"/>
+                      <w:sz w:val="17"/>
                     </w:rPr>
-                    <w:t>▸  "Voting Round Closed" — the chairman has paused voting. Keep the page open; it will update automatically.</w:t>
+                    <w:t>▸  "Voting Round Closed" — chairman has paused voting. Keep the page open; it updates automatically.</w:t>
                   </w:r>
                 </w:p>
                 <w:p>
@@ -1334,7 +1802,7 @@
                   <w:r>
                     <w:rPr>
                       <w:color w:val="444444"/>
-                      <w:sz w:val="18"/>
+                      <w:sz w:val="17"/>
                     </w:rPr>
                     <w:t>▸  "Token already used" — you have already voted this round. One vote per round per office.</w:t>
                   </w:r>
@@ -1346,9 +1814,9 @@
                   <w:r>
                     <w:rPr>
                       <w:color w:val="444444"/>
-                      <w:sz w:val="18"/>
+                      <w:sz w:val="17"/>
                     </w:rPr>
-                    <w:t>▸  Your vote is completely anonymous. No one can see what you selected.</w:t>
+                    <w:t>▸  Your vote is completely anonymous — no one can see what you selected.</w:t>
                   </w:r>
                 </w:p>
                 <w:p>
@@ -1358,9 +1826,9 @@
                   <w:r>
                     <w:rPr>
                       <w:color w:val="444444"/>
-                      <w:sz w:val="18"/>
+                      <w:sz w:val="17"/>
                     </w:rPr>
-                    <w:t>▸  One token card covers all rounds and both offices (Elder and Deacon).</w:t>
+                    <w:t>▸  One token card covers all rounds, both offices, and the congregational vote.</w:t>
                   </w:r>
                 </w:p>
                 <w:p>
@@ -1370,9 +1838,9 @@
                   <w:r>
                     <w:rPr>
                       <w:color w:val="444444"/>
-                      <w:sz w:val="18"/>
+                      <w:sz w:val="17"/>
                     </w:rPr>
-                    <w:t>▸  If you have difficulty, ask the paper ballot volunteer for a paper ballot instead.</w:t>
+                    <w:t>▸  Having trouble? Ask the paper ballot volunteer for a paper ballot instead.</w:t>
                   </w:r>
                 </w:p>
                 <w:p>
@@ -1395,15 +1863,15 @@
                 <w:color w:val="666666"/>
                 <w:sz w:val="16"/>
               </w:rPr>
-              <w:t>Your vote is anonymous  ·  Keep this page open until the election is complete</w:t>
+              <w:t>Your vote is anonymous  ·  Keep this page open until all voting is complete</w:t>
             </w:r>
           </w:p>
         </w:tc>
       </w:tr>
     </w:tbl>
     <w:sectPr>
-      <w:pgSz w:w="12240" w:h="15840"/>
-      <w:pgMar w:top="504" w:right="720" w:bottom="504" w:left="720" w:header="720" w:footer="720" w:gutter="0"/>
+      <w:pgSz w:w="11909" w:h="16834"/>
+      <w:pgMar w:top="432" w:right="648" w:bottom="432" w:left="648" w:header="720" w:footer="720" w:gutter="0"/>
       <w:cols w:space="720"/>
       <w:docGrid w:linePitch="360"/>
     </w:sectPr>

</xml_diff>